<commit_message>
AI-ML Roadmap v1.1: add Section 3 - how the propensity score is calculated (training data, features, model, calibration, attribution, ranking, cold start)
Co-Authored-By: Claude Fable 5 <noreply@anthropic.com>
</commit_message>
<xml_diff>
--- a/Enrollment Center/Enrollment Center - AI-ML Roadmap v1.0.docx
+++ b/Enrollment Center/Enrollment Center - AI-ML Roadmap v1.0.docx
@@ -159,7 +159,7 @@
               <w:rPr>
                 <w:sz w:val="18"/>
               </w:rPr>
-              <w:t>1.0 (Draft for Review)</w:t>
+              <w:t>1.1 (adds Section 3: propensity score calculation)</w:t>
             </w:r>
           </w:p>
         </w:tc>
@@ -1112,7 +1112,410 @@
         <w:pStyle w:val="Heading1"/>
       </w:pPr>
       <w:r>
-        <w:t>3. Governance: ML Recommends, BRFplus Decides</w:t>
+        <w:t>3. How the Recommendation Score (AI-1) Is Calculated</w:t>
+      </w:r>
+    </w:p>
+    <w:p>
+      <w:r>
+        <w:rPr>
+          <w:b w:val="0"/>
+        </w:rPr>
+        <w:t>The percentage shown next to a recommended program is a CALIBRATED ENROLLMENT PROBABILITY: P(customer enrolls in program X if offered). In the interactive demo the scores are illustrative seed values previewing the experience; in production they are produced by the following pipeline.</w:t>
+      </w:r>
+    </w:p>
+    <w:tbl>
+      <w:tblPr>
+        <w:tblStyle w:val="TableGrid"/>
+        <w:tblW w:type="auto" w:w="0"/>
+        <w:jc w:val="center"/>
+        <w:tblLayout w:type="fixed"/>
+        <w:tblLook w:firstColumn="1" w:firstRow="1" w:lastColumn="0" w:lastRow="0" w:noHBand="0" w:noVBand="1" w:val="04A0"/>
+      </w:tblPr>
+      <w:tblGrid>
+        <w:gridCol w:w="2880"/>
+        <w:gridCol w:w="2880"/>
+        <w:gridCol w:w="2880"/>
+      </w:tblGrid>
+      <w:tr>
+        <w:tc>
+          <w:tcPr>
+            <w:tcW w:type="dxa" w:w="1584"/>
+            <w:shd w:val="clear" w:fill="1F4E79"/>
+          </w:tcPr>
+          <w:p>
+            <w:r/>
+            <w:r>
+              <w:rPr>
+                <w:b/>
+                <w:color w:val="FFFFFF"/>
+                <w:sz w:val="16"/>
+              </w:rPr>
+              <w:t>Step</w:t>
+            </w:r>
+          </w:p>
+        </w:tc>
+        <w:tc>
+          <w:tcPr>
+            <w:tcW w:type="dxa" w:w="2736"/>
+            <w:shd w:val="clear" w:fill="1F4E79"/>
+          </w:tcPr>
+          <w:p>
+            <w:r/>
+            <w:r>
+              <w:rPr>
+                <w:b/>
+                <w:color w:val="FFFFFF"/>
+                <w:sz w:val="16"/>
+              </w:rPr>
+              <w:t>What Happens</w:t>
+            </w:r>
+          </w:p>
+        </w:tc>
+        <w:tc>
+          <w:tcPr>
+            <w:tcW w:type="dxa" w:w="5472"/>
+            <w:shd w:val="clear" w:fill="1F4E79"/>
+          </w:tcPr>
+          <w:p>
+            <w:r/>
+            <w:r>
+              <w:rPr>
+                <w:b/>
+                <w:color w:val="FFFFFF"/>
+                <w:sz w:val="16"/>
+              </w:rPr>
+              <w:t>Detail</w:t>
+            </w:r>
+          </w:p>
+        </w:tc>
+      </w:tr>
+      <w:tr>
+        <w:tc>
+          <w:tcPr>
+            <w:tcW w:type="dxa" w:w="1584"/>
+          </w:tcPr>
+          <w:p>
+            <w:r/>
+            <w:r>
+              <w:rPr>
+                <w:sz w:val="16"/>
+              </w:rPr>
+              <w:t>1. Training data</w:t>
+            </w:r>
+          </w:p>
+        </w:tc>
+        <w:tc>
+          <w:tcPr>
+            <w:tcW w:type="dxa" w:w="2736"/>
+          </w:tcPr>
+          <w:p>
+            <w:r/>
+            <w:r>
+              <w:rPr>
+                <w:sz w:val="16"/>
+              </w:rPr>
+              <w:t>The Enrollment Center labels its own examples</w:t>
+            </w:r>
+          </w:p>
+        </w:tc>
+        <w:tc>
+          <w:tcPr>
+            <w:tcW w:type="dxa" w:w="5472"/>
+          </w:tcPr>
+          <w:p>
+            <w:r/>
+            <w:r>
+              <w:rPr>
+                <w:sz w:val="16"/>
+              </w:rPr>
+              <w:t>Every display of the Available panel plus the outcome (enrolled within 30 days: yes/no) forms one example — accumulated in EnrollmentRequest / ZEC_ENROLL_HIST plus AI_RECO_shown/accepted telemetry from day one</w:t>
+            </w:r>
+          </w:p>
+        </w:tc>
+      </w:tr>
+      <w:tr>
+        <w:tc>
+          <w:tcPr>
+            <w:tcW w:type="dxa" w:w="1584"/>
+            <w:shd w:val="clear" w:fill="DEEAF6"/>
+          </w:tcPr>
+          <w:p>
+            <w:r/>
+            <w:r>
+              <w:rPr>
+                <w:sz w:val="16"/>
+              </w:rPr>
+              <w:t>2. Features</w:t>
+            </w:r>
+          </w:p>
+        </w:tc>
+        <w:tc>
+          <w:tcPr>
+            <w:tcW w:type="dxa" w:w="2736"/>
+            <w:shd w:val="clear" w:fill="DEEAF6"/>
+          </w:tcPr>
+          <w:p>
+            <w:r/>
+            <w:r>
+              <w:rPr>
+                <w:sz w:val="16"/>
+              </w:rPr>
+              <w:t>Same context already fetched for EC-01</w:t>
+            </w:r>
+          </w:p>
+        </w:tc>
+        <w:tc>
+          <w:tcPr>
+            <w:tcW w:type="dxa" w:w="5472"/>
+            <w:shd w:val="clear" w:fill="DEEAF6"/>
+          </w:tcPr>
+          <w:p>
+            <w:r/>
+            <w:r>
+              <w:rPr>
+                <w:sz w:val="16"/>
+              </w:rPr>
+              <w:t>Device type and status, DER assets, arrears and payment behavior, billing history length, current participation, program history (prior de-enrollments), usage aggregates from interval data, rate class, tenure, season</w:t>
+            </w:r>
+          </w:p>
+        </w:tc>
+      </w:tr>
+      <w:tr>
+        <w:tc>
+          <w:tcPr>
+            <w:tcW w:type="dxa" w:w="1584"/>
+          </w:tcPr>
+          <w:p>
+            <w:r/>
+            <w:r>
+              <w:rPr>
+                <w:sz w:val="16"/>
+              </w:rPr>
+              <w:t>3. Model</w:t>
+            </w:r>
+          </w:p>
+        </w:tc>
+        <w:tc>
+          <w:tcPr>
+            <w:tcW w:type="dxa" w:w="2736"/>
+          </w:tcPr>
+          <w:p>
+            <w:r/>
+            <w:r>
+              <w:rPr>
+                <w:sz w:val="16"/>
+              </w:rPr>
+              <w:t>Classification</w:t>
+            </w:r>
+          </w:p>
+        </w:tc>
+        <w:tc>
+          <w:tcPr>
+            <w:tcW w:type="dxa" w:w="5472"/>
+          </w:tcPr>
+          <w:p>
+            <w:r/>
+            <w:r>
+              <w:rPr>
+                <w:sz w:val="16"/>
+              </w:rPr>
+              <w:t>Gradient boosting or logistic regression via HANA Cloud APL/PAL (in-database, automated); per-program models or one multi-program model with the program as a feature; output = raw probability</w:t>
+            </w:r>
+          </w:p>
+        </w:tc>
+      </w:tr>
+      <w:tr>
+        <w:tc>
+          <w:tcPr>
+            <w:tcW w:type="dxa" w:w="1584"/>
+            <w:shd w:val="clear" w:fill="DEEAF6"/>
+          </w:tcPr>
+          <w:p>
+            <w:r/>
+            <w:r>
+              <w:rPr>
+                <w:sz w:val="16"/>
+              </w:rPr>
+              <w:t>4. Calibration</w:t>
+            </w:r>
+          </w:p>
+        </w:tc>
+        <w:tc>
+          <w:tcPr>
+            <w:tcW w:type="dxa" w:w="2736"/>
+            <w:shd w:val="clear" w:fill="DEEAF6"/>
+          </w:tcPr>
+          <w:p>
+            <w:r/>
+            <w:r>
+              <w:rPr>
+                <w:sz w:val="16"/>
+              </w:rPr>
+              <w:t>Raw probability becomes a trustworthy %</w:t>
+            </w:r>
+          </w:p>
+        </w:tc>
+        <w:tc>
+          <w:tcPr>
+            <w:tcW w:type="dxa" w:w="5472"/>
+            <w:shd w:val="clear" w:fill="DEEAF6"/>
+          </w:tcPr>
+          <w:p>
+            <w:r/>
+            <w:r>
+              <w:rPr>
+                <w:sz w:val="16"/>
+              </w:rPr>
+              <w:t>Platt scaling / isotonic regression so that ~87% of customers scored 87% actually enroll when offered — the property that makes the number defensible</w:t>
+            </w:r>
+          </w:p>
+        </w:tc>
+      </w:tr>
+      <w:tr>
+        <w:tc>
+          <w:tcPr>
+            <w:tcW w:type="dxa" w:w="1584"/>
+          </w:tcPr>
+          <w:p>
+            <w:r/>
+            <w:r>
+              <w:rPr>
+                <w:sz w:val="16"/>
+              </w:rPr>
+              <w:t>5. Reason line</w:t>
+            </w:r>
+          </w:p>
+        </w:tc>
+        <w:tc>
+          <w:tcPr>
+            <w:tcW w:type="dxa" w:w="2736"/>
+          </w:tcPr>
+          <w:p>
+            <w:r/>
+            <w:r>
+              <w:rPr>
+                <w:sz w:val="16"/>
+              </w:rPr>
+              <w:t>Feature attribution, not free text</w:t>
+            </w:r>
+          </w:p>
+        </w:tc>
+        <w:tc>
+          <w:tcPr>
+            <w:tcW w:type="dxa" w:w="5472"/>
+          </w:tcPr>
+          <w:p>
+            <w:r/>
+            <w:r>
+              <w:rPr>
+                <w:sz w:val="16"/>
+              </w:rPr>
+              <w:t>Top contributing features (APL variable contributions / SHAP) mapped to human-readable templates — the agent always sees WHY (governance requirement, Section 4)</w:t>
+            </w:r>
+          </w:p>
+        </w:tc>
+      </w:tr>
+      <w:tr>
+        <w:tc>
+          <w:tcPr>
+            <w:tcW w:type="dxa" w:w="1584"/>
+            <w:shd w:val="clear" w:fill="DEEAF6"/>
+          </w:tcPr>
+          <w:p>
+            <w:r/>
+            <w:r>
+              <w:rPr>
+                <w:sz w:val="16"/>
+              </w:rPr>
+              <w:t>6. Ranking</w:t>
+            </w:r>
+          </w:p>
+        </w:tc>
+        <w:tc>
+          <w:tcPr>
+            <w:tcW w:type="dxa" w:w="2736"/>
+            <w:shd w:val="clear" w:fill="DEEAF6"/>
+          </w:tcPr>
+          <w:p>
+            <w:r/>
+            <w:r>
+              <w:rPr>
+                <w:sz w:val="16"/>
+              </w:rPr>
+              <w:t>Not the % alone</w:t>
+            </w:r>
+          </w:p>
+        </w:tc>
+        <w:tc>
+          <w:tcPr>
+            <w:tcW w:type="dxa" w:w="5472"/>
+            <w:shd w:val="clear" w:fill="DEEAF6"/>
+          </w:tcPr>
+          <w:p>
+            <w:r/>
+            <w:r>
+              <w:rPr>
+                <w:sz w:val="16"/>
+              </w:rPr>
+              <w:t>Sort order = propensity x expected program value, so a 60% chance at a high-value DR enrollment can outrank a 90% chance at eBill; the displayed % remains the propensity component</w:t>
+            </w:r>
+          </w:p>
+        </w:tc>
+      </w:tr>
+    </w:tbl>
+    <w:p>
+      <w:pPr>
+        <w:spacing w:after="40"/>
+      </w:pPr>
+    </w:p>
+    <w:p>
+      <w:pPr>
+        <w:pStyle w:val="ListBullet"/>
+      </w:pPr>
+      <w:r>
+        <w:rPr>
+          <w:b/>
+        </w:rPr>
+        <w:t xml:space="preserve">Cold start — </w:t>
+      </w:r>
+      <w:r>
+        <w:t>at go-live there is no outcome history: Phase 1 begins with rules-based heuristic scoring (weighted business rules, e.g. registered EV charger adds strongly to EV Managed Charging) presented identically in the UI, swapped for the trained model after ~3-6 months of outcomes.</w:t>
+      </w:r>
+    </w:p>
+    <w:p>
+      <w:pPr>
+        <w:pStyle w:val="ListBullet"/>
+      </w:pPr>
+      <w:r>
+        <w:rPr>
+          <w:b/>
+        </w:rPr>
+        <w:t xml:space="preserve">Quality monitoring — </w:t>
+      </w:r>
+      <w:r>
+        <w:t>calibration drift and recommendation acceptance rate reviewed quarterly (Section 5 KPIs); models retrained on a schedule, versioned in AI Launchpad.</w:t>
+      </w:r>
+    </w:p>
+    <w:p>
+      <w:pPr>
+        <w:pStyle w:val="ListBullet"/>
+      </w:pPr>
+      <w:r>
+        <w:rPr>
+          <w:b/>
+        </w:rPr>
+        <w:t xml:space="preserve">One-sentence answer for stakeholders — </w:t>
+      </w:r>
+      <w:r>
+        <w:t>'The percentage is a calibrated enrollment probability learned from our own enrollment outcomes, with the driving factors shown to the agent — in the demo it is illustrative seed data.'</w:t>
+      </w:r>
+    </w:p>
+    <w:p>
+      <w:pPr>
+        <w:pStyle w:val="Heading1"/>
+      </w:pPr>
+      <w:r>
+        <w:t>4. Governance: ML Recommends, BRFplus Decides</w:t>
       </w:r>
     </w:p>
     <w:p>
@@ -1154,7 +1557,7 @@
         <w:t xml:space="preserve">Explainability — </w:t>
       </w:r>
       <w:r>
-        <w:t>recommendation reasons shown to the agent (feature-based, e.g., 'EV charger registered'); generative outputs grounded on the catalog with source attribution; no free hallucination surface.</w:t>
+        <w:t>recommendation reasons shown to the agent (feature-based, per Section 3 step 5); generative outputs grounded on the catalog with source attribution; no free hallucination surface.</w:t>
       </w:r>
     </w:p>
     <w:p>
@@ -1204,7 +1607,7 @@
         <w:pStyle w:val="Heading1"/>
       </w:pPr>
       <w:r>
-        <w:t>4. Architecture Integration (no redesign required)</w:t>
+        <w:t>5. Architecture Integration (no redesign required)</w:t>
       </w:r>
     </w:p>
     <w:tbl>
@@ -1557,7 +1960,7 @@
         <w:pStyle w:val="Heading1"/>
       </w:pPr>
       <w:r>
-        <w:t>5. Phasing and KPIs</w:t>
+        <w:t>6. Phasing and KPIs</w:t>
       </w:r>
     </w:p>
     <w:tbl>

</xml_diff>